<commit_message>
NJueva version del  vision
</commit_message>
<xml_diff>
--- a/Documentos/SistemaMMA_Plantilla_Vision_.docx
+++ b/Documentos/SistemaMMA_Plantilla_Vision_.docx
@@ -120,14 +120,11 @@
           <w:rFonts w:cs="Times New Roman"/>
           <w:b/>
           <w:bCs/>
-          <w:sz w:val="24"/>
-          <w:szCs w:val="24"/>
-        </w:rPr>
-      </w:pPr>
-    </w:p>
-    <w:p>
-      <w:pPr>
-        <w:jc w:val="center"/>
+          <w:sz w:val="28"/>
+          <w:szCs w:val="28"/>
+        </w:rPr>
+      </w:pPr>
+      <w:r>
         <w:rPr>
           <w:rFonts w:cs="Times New Roman"/>
           <w:b/>
@@ -135,8 +132,12 @@
           <w:sz w:val="28"/>
           <w:szCs w:val="28"/>
         </w:rPr>
-      </w:pPr>
-      <w:r>
+        <w:t>FACULTAD DE INGENIERÍA</w:t>
+      </w:r>
+    </w:p>
+    <w:p>
+      <w:pPr>
+        <w:jc w:val="center"/>
         <w:rPr>
           <w:rFonts w:cs="Times New Roman"/>
           <w:b/>
@@ -144,24 +145,8 @@
           <w:sz w:val="28"/>
           <w:szCs w:val="28"/>
         </w:rPr>
-        <w:t>FACULTAD DE INGENIERÍA</w:t>
-      </w:r>
-    </w:p>
-    <w:p>
-      <w:pPr>
-        <w:jc w:val="center"/>
-        <w:rPr>
-          <w:rFonts w:cs="Times New Roman"/>
-          <w:b/>
-          <w:bCs/>
-          <w:sz w:val="24"/>
-          <w:szCs w:val="24"/>
-        </w:rPr>
-      </w:pPr>
-    </w:p>
-    <w:p>
-      <w:pPr>
-        <w:jc w:val="center"/>
+      </w:pPr>
+      <w:r>
         <w:rPr>
           <w:rFonts w:cs="Times New Roman"/>
           <w:b/>
@@ -169,8 +154,12 @@
           <w:sz w:val="28"/>
           <w:szCs w:val="28"/>
         </w:rPr>
-      </w:pPr>
-      <w:r>
+        <w:t>CARRERA DE INGENIERÍA EN COMPUTACIÓN</w:t>
+      </w:r>
+    </w:p>
+    <w:p>
+      <w:pPr>
+        <w:jc w:val="center"/>
         <w:rPr>
           <w:rFonts w:cs="Times New Roman"/>
           <w:b/>
@@ -178,24 +167,8 @@
           <w:sz w:val="28"/>
           <w:szCs w:val="28"/>
         </w:rPr>
-        <w:t>CARRERA DE INGENIERÍA EN COMPUTACIÓN</w:t>
-      </w:r>
-    </w:p>
-    <w:p>
-      <w:pPr>
-        <w:jc w:val="center"/>
-        <w:rPr>
-          <w:rFonts w:cs="Times New Roman"/>
-          <w:b/>
-          <w:bCs/>
-          <w:sz w:val="24"/>
-          <w:szCs w:val="24"/>
-        </w:rPr>
-      </w:pPr>
-    </w:p>
-    <w:p>
-      <w:pPr>
-        <w:jc w:val="center"/>
+      </w:pPr>
+      <w:r>
         <w:rPr>
           <w:rFonts w:cs="Times New Roman"/>
           <w:b/>
@@ -203,7 +176,9 @@
           <w:sz w:val="28"/>
           <w:szCs w:val="28"/>
         </w:rPr>
-      </w:pPr>
+        <w:t xml:space="preserve">Caso de </w:t>
+      </w:r>
+      <w:proofErr w:type="spellStart"/>
       <w:r>
         <w:rPr>
           <w:rFonts w:cs="Times New Roman"/>
@@ -212,10 +187,95 @@
           <w:sz w:val="28"/>
           <w:szCs w:val="28"/>
         </w:rPr>
-        <w:t xml:space="preserve">Caso de </w:t>
+        <w:t>Estudio</w:t>
+      </w:r>
+      <w:proofErr w:type="spellEnd"/>
+    </w:p>
+    <w:p>
+      <w:pPr>
+        <w:jc w:val="center"/>
+        <w:rPr>
+          <w:rFonts w:cs="Times New Roman"/>
+        </w:rPr>
+      </w:pPr>
+      <w:r>
+        <w:rPr>
+          <w:rFonts w:cs="Times New Roman"/>
+        </w:rPr>
+        <w:t xml:space="preserve">Sistema de </w:t>
       </w:r>
       <w:proofErr w:type="spellStart"/>
       <w:r>
+        <w:rPr>
+          <w:rFonts w:cs="Times New Roman"/>
+        </w:rPr>
+        <w:t>Gesti</w:t>
+      </w:r>
+      <w:r>
+        <w:rPr>
+          <w:rFonts w:cs="Times New Roman"/>
+        </w:rPr>
+        <w:t>ó</w:t>
+      </w:r>
+      <w:r>
+        <w:rPr>
+          <w:rFonts w:cs="Times New Roman"/>
+        </w:rPr>
+        <w:t>n</w:t>
+      </w:r>
+      <w:proofErr w:type="spellEnd"/>
+      <w:r>
+        <w:rPr>
+          <w:rFonts w:cs="Times New Roman"/>
+        </w:rPr>
+        <w:t xml:space="preserve"> </w:t>
+      </w:r>
+      <w:proofErr w:type="gramStart"/>
+      <w:r>
+        <w:rPr>
+          <w:rFonts w:cs="Times New Roman"/>
+        </w:rPr>
+        <w:t>para Academia</w:t>
+      </w:r>
+      <w:proofErr w:type="gramEnd"/>
+      <w:r>
+        <w:rPr>
+          <w:rFonts w:cs="Times New Roman"/>
+        </w:rPr>
+        <w:t xml:space="preserve"> de Artes </w:t>
+      </w:r>
+      <w:proofErr w:type="spellStart"/>
+      <w:r>
+        <w:rPr>
+          <w:rFonts w:cs="Times New Roman"/>
+        </w:rPr>
+        <w:t>Marciales</w:t>
+      </w:r>
+      <w:proofErr w:type="spellEnd"/>
+      <w:r>
+        <w:rPr>
+          <w:rFonts w:cs="Times New Roman"/>
+        </w:rPr>
+        <w:t xml:space="preserve"> </w:t>
+      </w:r>
+      <w:proofErr w:type="spellStart"/>
+      <w:r>
+        <w:rPr>
+          <w:rFonts w:cs="Times New Roman"/>
+        </w:rPr>
+        <w:t>Mixtas</w:t>
+      </w:r>
+      <w:proofErr w:type="spellEnd"/>
+      <w:r>
+        <w:rPr>
+          <w:rFonts w:cs="Times New Roman"/>
+        </w:rPr>
+        <w:t xml:space="preserve"> (MMA)</w:t>
+      </w:r>
+    </w:p>
+    <w:p>
+      <w:pPr>
+        <w:jc w:val="center"/>
         <w:rPr>
           <w:rFonts w:cs="Times New Roman"/>
           <w:b/>
@@ -223,95 +283,9 @@
           <w:sz w:val="28"/>
           <w:szCs w:val="28"/>
         </w:rPr>
-        <w:t>Estudio</w:t>
-      </w:r>
-      <w:proofErr w:type="spellEnd"/>
-    </w:p>
-    <w:p>
-      <w:pPr>
-        <w:jc w:val="center"/>
-        <w:rPr>
-          <w:rFonts w:cs="Times New Roman"/>
-        </w:rPr>
-      </w:pPr>
-      <w:r>
-        <w:rPr>
-          <w:rFonts w:cs="Times New Roman"/>
-        </w:rPr>
-        <w:t xml:space="preserve">Sistema de </w:t>
-      </w:r>
+      </w:pPr>
       <w:proofErr w:type="spellStart"/>
       <w:r>
-        <w:rPr>
-          <w:rFonts w:cs="Times New Roman"/>
-        </w:rPr>
-        <w:t>Gesti</w:t>
-      </w:r>
-      <w:r>
-        <w:rPr>
-          <w:rFonts w:cs="Times New Roman"/>
-        </w:rPr>
-        <w:t>ó</w:t>
-      </w:r>
-      <w:r>
-        <w:rPr>
-          <w:rFonts w:cs="Times New Roman"/>
-        </w:rPr>
-        <w:t>n</w:t>
-      </w:r>
-      <w:proofErr w:type="spellEnd"/>
-      <w:r>
-        <w:rPr>
-          <w:rFonts w:cs="Times New Roman"/>
-        </w:rPr>
-        <w:t xml:space="preserve"> </w:t>
-      </w:r>
-      <w:proofErr w:type="gramStart"/>
-      <w:r>
-        <w:rPr>
-          <w:rFonts w:cs="Times New Roman"/>
-        </w:rPr>
-        <w:t>para Academia</w:t>
-      </w:r>
-      <w:proofErr w:type="gramEnd"/>
-      <w:r>
-        <w:rPr>
-          <w:rFonts w:cs="Times New Roman"/>
-        </w:rPr>
-        <w:t xml:space="preserve"> de Artes </w:t>
-      </w:r>
-      <w:proofErr w:type="spellStart"/>
-      <w:r>
-        <w:rPr>
-          <w:rFonts w:cs="Times New Roman"/>
-        </w:rPr>
-        <w:t>Marciales</w:t>
-      </w:r>
-      <w:proofErr w:type="spellEnd"/>
-      <w:r>
-        <w:rPr>
-          <w:rFonts w:cs="Times New Roman"/>
-        </w:rPr>
-        <w:t xml:space="preserve"> </w:t>
-      </w:r>
-      <w:proofErr w:type="spellStart"/>
-      <w:r>
-        <w:rPr>
-          <w:rFonts w:cs="Times New Roman"/>
-        </w:rPr>
-        <w:t>Mixtas</w:t>
-      </w:r>
-      <w:proofErr w:type="spellEnd"/>
-      <w:r>
-        <w:rPr>
-          <w:rFonts w:cs="Times New Roman"/>
-        </w:rPr>
-        <w:t xml:space="preserve"> (MMA)</w:t>
-      </w:r>
-    </w:p>
-    <w:p>
-      <w:pPr>
-        <w:jc w:val="center"/>
         <w:rPr>
           <w:rFonts w:cs="Times New Roman"/>
           <w:b/>
@@ -319,8 +293,9 @@
           <w:sz w:val="28"/>
           <w:szCs w:val="28"/>
         </w:rPr>
-      </w:pPr>
-      <w:proofErr w:type="spellStart"/>
+        <w:t>Nombre</w:t>
+      </w:r>
+      <w:proofErr w:type="spellEnd"/>
       <w:r>
         <w:rPr>
           <w:rFonts w:cs="Times New Roman"/>
@@ -329,9 +304,8 @@
           <w:sz w:val="28"/>
           <w:szCs w:val="28"/>
         </w:rPr>
-        <w:t>Nombre</w:t>
+        <w:t xml:space="preserve"> de</w:t>
       </w:r>
-      <w:proofErr w:type="spellEnd"/>
       <w:r>
         <w:rPr>
           <w:rFonts w:cs="Times New Roman"/>
@@ -340,8 +314,9 @@
           <w:sz w:val="28"/>
           <w:szCs w:val="28"/>
         </w:rPr>
-        <w:t xml:space="preserve"> de</w:t>
+        <w:t xml:space="preserve"> los </w:t>
       </w:r>
+      <w:proofErr w:type="spellStart"/>
       <w:r>
         <w:rPr>
           <w:rFonts w:cs="Times New Roman"/>
@@ -350,9 +325,9 @@
           <w:sz w:val="28"/>
           <w:szCs w:val="28"/>
         </w:rPr>
-        <w:t xml:space="preserve"> los </w:t>
+        <w:t>integrantes</w:t>
       </w:r>
-      <w:proofErr w:type="spellStart"/>
+      <w:proofErr w:type="spellEnd"/>
       <w:r>
         <w:rPr>
           <w:rFonts w:cs="Times New Roman"/>
@@ -361,17 +336,6 @@
           <w:sz w:val="28"/>
           <w:szCs w:val="28"/>
         </w:rPr>
-        <w:t>integrantes</w:t>
-      </w:r>
-      <w:proofErr w:type="spellEnd"/>
-      <w:r>
-        <w:rPr>
-          <w:rFonts w:cs="Times New Roman"/>
-          <w:b/>
-          <w:bCs/>
-          <w:sz w:val="28"/>
-          <w:szCs w:val="28"/>
-        </w:rPr>
         <w:t>:</w:t>
       </w:r>
     </w:p>
@@ -387,6 +351,100 @@
           <w:rFonts w:cs="Times New Roman"/>
         </w:rPr>
         <w:t>García Coronado Ariel Alejandro</w:t>
+      </w:r>
+    </w:p>
+    <w:p>
+      <w:pPr>
+        <w:jc w:val="center"/>
+        <w:rPr>
+          <w:rFonts w:cs="Times New Roman"/>
+        </w:rPr>
+      </w:pPr>
+      <w:proofErr w:type="spellStart"/>
+      <w:r>
+        <w:rPr>
+          <w:rFonts w:cs="Times New Roman"/>
+        </w:rPr>
+        <w:t>Banchon</w:t>
+      </w:r>
+      <w:proofErr w:type="spellEnd"/>
+      <w:r>
+        <w:rPr>
+          <w:rFonts w:cs="Times New Roman"/>
+        </w:rPr>
+        <w:t xml:space="preserve"> Miranda Alex Xavier</w:t>
+      </w:r>
+    </w:p>
+    <w:p>
+      <w:pPr>
+        <w:jc w:val="center"/>
+        <w:rPr>
+          <w:rFonts w:cs="Times New Roman"/>
+        </w:rPr>
+      </w:pPr>
+      <w:r>
+        <w:rPr>
+          <w:rFonts w:cs="Times New Roman"/>
+        </w:rPr>
+        <w:t>Cuenca Guerrero Bryan Alejandro</w:t>
+      </w:r>
+    </w:p>
+    <w:p>
+      <w:pPr>
+        <w:jc w:val="center"/>
+        <w:rPr>
+          <w:rFonts w:cs="Times New Roman"/>
+        </w:rPr>
+      </w:pPr>
+      <w:proofErr w:type="spellStart"/>
+      <w:r>
+        <w:rPr>
+          <w:rFonts w:cs="Times New Roman"/>
+        </w:rPr>
+        <w:t>Suntasig</w:t>
+      </w:r>
+      <w:proofErr w:type="spellEnd"/>
+      <w:r>
+        <w:rPr>
+          <w:rFonts w:cs="Times New Roman"/>
+        </w:rPr>
+        <w:t xml:space="preserve"> Moreno </w:t>
+      </w:r>
+      <w:proofErr w:type="spellStart"/>
+      <w:r>
+        <w:rPr>
+          <w:rFonts w:cs="Times New Roman"/>
+        </w:rPr>
+        <w:t>Jhonatan</w:t>
+      </w:r>
+      <w:proofErr w:type="spellEnd"/>
+      <w:r>
+        <w:rPr>
+          <w:rFonts w:cs="Times New Roman"/>
+        </w:rPr>
+        <w:t xml:space="preserve"> David</w:t>
+      </w:r>
+    </w:p>
+    <w:p>
+      <w:pPr>
+        <w:jc w:val="center"/>
+        <w:rPr>
+          <w:rFonts w:cs="Times New Roman"/>
+        </w:rPr>
+      </w:pPr>
+      <w:proofErr w:type="spellStart"/>
+      <w:r>
+        <w:rPr>
+          <w:rFonts w:cs="Times New Roman"/>
+        </w:rPr>
+        <w:t>Uwaoma</w:t>
+      </w:r>
+      <w:proofErr w:type="spellEnd"/>
+      <w:r>
+        <w:rPr>
+          <w:rFonts w:cs="Times New Roman"/>
+        </w:rPr>
+        <w:t xml:space="preserve"> Santos Wesley Ikechukwu</w:t>
       </w:r>
     </w:p>
     <w:p>
@@ -6107,7 +6165,31 @@
         <w:rPr>
           <w:lang w:val="es-EC"/>
         </w:rPr>
-        <w:t>El scrum Master del equipo será Ariel García.</w:t>
+        <w:t xml:space="preserve">El scrum Master del equipo será Ariel </w:t>
+      </w:r>
+      <w:r>
+        <w:rPr>
+          <w:lang w:val="es-EC"/>
+        </w:rPr>
+        <w:t xml:space="preserve">Alejandro </w:t>
+      </w:r>
+      <w:r>
+        <w:rPr>
+          <w:lang w:val="es-EC"/>
+        </w:rPr>
+        <w:t>García</w:t>
+      </w:r>
+      <w:r>
+        <w:rPr>
+          <w:lang w:val="es-EC"/>
+        </w:rPr>
+        <w:t xml:space="preserve"> Coronado</w:t>
+      </w:r>
+      <w:r>
+        <w:rPr>
+          <w:lang w:val="es-EC"/>
+        </w:rPr>
+        <w:t>.</w:t>
       </w:r>
     </w:p>
     <w:p>
@@ -6166,17 +6248,133 @@
         <w:pStyle w:val="Prrafodelista"/>
         <w:numPr>
           <w:ilvl w:val="0"/>
-          <w:numId w:val="16"/>
+          <w:numId w:val="18"/>
         </w:numPr>
         <w:rPr>
-          <w:lang w:val="es-EC"/>
+          <w:rFonts w:cs="Times New Roman"/>
         </w:rPr>
       </w:pPr>
       <w:r>
         <w:rPr>
-          <w:lang w:val="es-EC"/>
-        </w:rPr>
-        <w:t>Ariel Alejandro García Coronado.</w:t>
+          <w:rFonts w:cs="Times New Roman"/>
+        </w:rPr>
+        <w:t>García Coronado Ariel Alejandro</w:t>
+      </w:r>
+    </w:p>
+    <w:p>
+      <w:pPr>
+        <w:pStyle w:val="Prrafodelista"/>
+        <w:numPr>
+          <w:ilvl w:val="0"/>
+          <w:numId w:val="18"/>
+        </w:numPr>
+        <w:rPr>
+          <w:rFonts w:cs="Times New Roman"/>
+        </w:rPr>
+      </w:pPr>
+      <w:proofErr w:type="spellStart"/>
+      <w:r>
+        <w:rPr>
+          <w:rFonts w:cs="Times New Roman"/>
+        </w:rPr>
+        <w:t>Banchon</w:t>
+      </w:r>
+      <w:proofErr w:type="spellEnd"/>
+      <w:r>
+        <w:rPr>
+          <w:rFonts w:cs="Times New Roman"/>
+        </w:rPr>
+        <w:t xml:space="preserve"> Miranda Alex Xavier</w:t>
+      </w:r>
+    </w:p>
+    <w:p>
+      <w:pPr>
+        <w:pStyle w:val="Prrafodelista"/>
+        <w:numPr>
+          <w:ilvl w:val="0"/>
+          <w:numId w:val="18"/>
+        </w:numPr>
+        <w:rPr>
+          <w:rFonts w:cs="Times New Roman"/>
+        </w:rPr>
+      </w:pPr>
+      <w:r>
+        <w:rPr>
+          <w:rFonts w:cs="Times New Roman"/>
+        </w:rPr>
+        <w:t>Cuenca Guerrero Bryan Alejandro</w:t>
+      </w:r>
+    </w:p>
+    <w:p>
+      <w:pPr>
+        <w:pStyle w:val="Prrafodelista"/>
+        <w:numPr>
+          <w:ilvl w:val="0"/>
+          <w:numId w:val="18"/>
+        </w:numPr>
+        <w:rPr>
+          <w:rFonts w:cs="Times New Roman"/>
+        </w:rPr>
+      </w:pPr>
+      <w:proofErr w:type="spellStart"/>
+      <w:r>
+        <w:rPr>
+          <w:rFonts w:cs="Times New Roman"/>
+        </w:rPr>
+        <w:t>Suntasig</w:t>
+      </w:r>
+      <w:proofErr w:type="spellEnd"/>
+      <w:r>
+        <w:rPr>
+          <w:rFonts w:cs="Times New Roman"/>
+        </w:rPr>
+        <w:t xml:space="preserve"> Moreno </w:t>
+      </w:r>
+      <w:proofErr w:type="spellStart"/>
+      <w:r>
+        <w:rPr>
+          <w:rFonts w:cs="Times New Roman"/>
+        </w:rPr>
+        <w:t>J</w:t>
+      </w:r>
+      <w:r>
+        <w:rPr>
+          <w:rFonts w:cs="Times New Roman"/>
+        </w:rPr>
+        <w:t>honatan</w:t>
+      </w:r>
+      <w:proofErr w:type="spellEnd"/>
+      <w:r>
+        <w:rPr>
+          <w:rFonts w:cs="Times New Roman"/>
+        </w:rPr>
+        <w:t xml:space="preserve"> David</w:t>
+      </w:r>
+    </w:p>
+    <w:p>
+      <w:pPr>
+        <w:pStyle w:val="Prrafodelista"/>
+        <w:numPr>
+          <w:ilvl w:val="0"/>
+          <w:numId w:val="18"/>
+        </w:numPr>
+        <w:rPr>
+          <w:rFonts w:cs="Times New Roman"/>
+        </w:rPr>
+      </w:pPr>
+      <w:proofErr w:type="spellStart"/>
+      <w:r>
+        <w:rPr>
+          <w:rFonts w:cs="Times New Roman"/>
+        </w:rPr>
+        <w:t>Uwaoma</w:t>
+      </w:r>
+      <w:proofErr w:type="spellEnd"/>
+      <w:r>
+        <w:rPr>
+          <w:rFonts w:cs="Times New Roman"/>
+        </w:rPr>
+        <w:t xml:space="preserve"> Santos Wesley Ikechukwu</w:t>
       </w:r>
     </w:p>
     <w:p>
@@ -7018,6 +7216,119 @@
     </w:lvl>
   </w:abstractNum>
   <w:abstractNum w:abstractNumId="10" w15:restartNumberingAfterBreak="0">
+    <w:nsid w:val="193E1595"/>
+    <w:multiLevelType w:val="hybridMultilevel"/>
+    <w:tmpl w:val="76E0F2F4"/>
+    <w:lvl w:ilvl="0" w:tplc="300A0001">
+      <w:start w:val="1"/>
+      <w:numFmt w:val="bullet"/>
+      <w:lvlText w:val=""/>
+      <w:lvlJc w:val="left"/>
+      <w:pPr>
+        <w:ind w:left="720" w:hanging="360"/>
+      </w:pPr>
+      <w:rPr>
+        <w:rFonts w:ascii="Symbol" w:hAnsi="Symbol" w:hint="default"/>
+      </w:rPr>
+    </w:lvl>
+    <w:lvl w:ilvl="1" w:tplc="300A0003" w:tentative="1">
+      <w:start w:val="1"/>
+      <w:numFmt w:val="bullet"/>
+      <w:lvlText w:val="o"/>
+      <w:lvlJc w:val="left"/>
+      <w:pPr>
+        <w:ind w:left="1440" w:hanging="360"/>
+      </w:pPr>
+      <w:rPr>
+        <w:rFonts w:ascii="Courier New" w:hAnsi="Courier New" w:cs="Courier New" w:hint="default"/>
+      </w:rPr>
+    </w:lvl>
+    <w:lvl w:ilvl="2" w:tplc="300A0005" w:tentative="1">
+      <w:start w:val="1"/>
+      <w:numFmt w:val="bullet"/>
+      <w:lvlText w:val=""/>
+      <w:lvlJc w:val="left"/>
+      <w:pPr>
+        <w:ind w:left="2160" w:hanging="360"/>
+      </w:pPr>
+      <w:rPr>
+        <w:rFonts w:ascii="Wingdings" w:hAnsi="Wingdings" w:hint="default"/>
+      </w:rPr>
+    </w:lvl>
+    <w:lvl w:ilvl="3" w:tplc="300A0001" w:tentative="1">
+      <w:start w:val="1"/>
+      <w:numFmt w:val="bullet"/>
+      <w:lvlText w:val=""/>
+      <w:lvlJc w:val="left"/>
+      <w:pPr>
+        <w:ind w:left="2880" w:hanging="360"/>
+      </w:pPr>
+      <w:rPr>
+        <w:rFonts w:ascii="Symbol" w:hAnsi="Symbol" w:hint="default"/>
+      </w:rPr>
+    </w:lvl>
+    <w:lvl w:ilvl="4" w:tplc="300A0003" w:tentative="1">
+      <w:start w:val="1"/>
+      <w:numFmt w:val="bullet"/>
+      <w:lvlText w:val="o"/>
+      <w:lvlJc w:val="left"/>
+      <w:pPr>
+        <w:ind w:left="3600" w:hanging="360"/>
+      </w:pPr>
+      <w:rPr>
+        <w:rFonts w:ascii="Courier New" w:hAnsi="Courier New" w:cs="Courier New" w:hint="default"/>
+      </w:rPr>
+    </w:lvl>
+    <w:lvl w:ilvl="5" w:tplc="300A0005" w:tentative="1">
+      <w:start w:val="1"/>
+      <w:numFmt w:val="bullet"/>
+      <w:lvlText w:val=""/>
+      <w:lvlJc w:val="left"/>
+      <w:pPr>
+        <w:ind w:left="4320" w:hanging="360"/>
+      </w:pPr>
+      <w:rPr>
+        <w:rFonts w:ascii="Wingdings" w:hAnsi="Wingdings" w:hint="default"/>
+      </w:rPr>
+    </w:lvl>
+    <w:lvl w:ilvl="6" w:tplc="300A0001" w:tentative="1">
+      <w:start w:val="1"/>
+      <w:numFmt w:val="bullet"/>
+      <w:lvlText w:val=""/>
+      <w:lvlJc w:val="left"/>
+      <w:pPr>
+        <w:ind w:left="5040" w:hanging="360"/>
+      </w:pPr>
+      <w:rPr>
+        <w:rFonts w:ascii="Symbol" w:hAnsi="Symbol" w:hint="default"/>
+      </w:rPr>
+    </w:lvl>
+    <w:lvl w:ilvl="7" w:tplc="300A0003" w:tentative="1">
+      <w:start w:val="1"/>
+      <w:numFmt w:val="bullet"/>
+      <w:lvlText w:val="o"/>
+      <w:lvlJc w:val="left"/>
+      <w:pPr>
+        <w:ind w:left="5760" w:hanging="360"/>
+      </w:pPr>
+      <w:rPr>
+        <w:rFonts w:ascii="Courier New" w:hAnsi="Courier New" w:cs="Courier New" w:hint="default"/>
+      </w:rPr>
+    </w:lvl>
+    <w:lvl w:ilvl="8" w:tplc="300A0005" w:tentative="1">
+      <w:start w:val="1"/>
+      <w:numFmt w:val="bullet"/>
+      <w:lvlText w:val=""/>
+      <w:lvlJc w:val="left"/>
+      <w:pPr>
+        <w:ind w:left="6480" w:hanging="360"/>
+      </w:pPr>
+      <w:rPr>
+        <w:rFonts w:ascii="Wingdings" w:hAnsi="Wingdings" w:hint="default"/>
+      </w:rPr>
+    </w:lvl>
+  </w:abstractNum>
+  <w:abstractNum w:abstractNumId="11" w15:restartNumberingAfterBreak="0">
     <w:nsid w:val="19A80A0C"/>
     <w:multiLevelType w:val="hybridMultilevel"/>
     <w:tmpl w:val="453C653E"/>
@@ -7130,7 +7441,7 @@
       </w:rPr>
     </w:lvl>
   </w:abstractNum>
-  <w:abstractNum w:abstractNumId="11" w15:restartNumberingAfterBreak="0">
+  <w:abstractNum w:abstractNumId="12" w15:restartNumberingAfterBreak="0">
     <w:nsid w:val="1F9D0BF8"/>
     <w:multiLevelType w:val="hybridMultilevel"/>
     <w:tmpl w:val="A1E688F6"/>
@@ -7243,7 +7554,7 @@
       </w:rPr>
     </w:lvl>
   </w:abstractNum>
-  <w:abstractNum w:abstractNumId="12" w15:restartNumberingAfterBreak="0">
+  <w:abstractNum w:abstractNumId="13" w15:restartNumberingAfterBreak="0">
     <w:nsid w:val="26D629AB"/>
     <w:multiLevelType w:val="hybridMultilevel"/>
     <w:tmpl w:val="6C9C2330"/>
@@ -7356,7 +7667,7 @@
       </w:rPr>
     </w:lvl>
   </w:abstractNum>
-  <w:abstractNum w:abstractNumId="13" w15:restartNumberingAfterBreak="0">
+  <w:abstractNum w:abstractNumId="14" w15:restartNumberingAfterBreak="0">
     <w:nsid w:val="51AD314E"/>
     <w:multiLevelType w:val="hybridMultilevel"/>
     <w:tmpl w:val="67C219F2"/>
@@ -7469,7 +7780,7 @@
       </w:rPr>
     </w:lvl>
   </w:abstractNum>
-  <w:abstractNum w:abstractNumId="14" w15:restartNumberingAfterBreak="0">
+  <w:abstractNum w:abstractNumId="15" w15:restartNumberingAfterBreak="0">
     <w:nsid w:val="62C03BF7"/>
     <w:multiLevelType w:val="hybridMultilevel"/>
     <w:tmpl w:val="88BC0F48"/>
@@ -7582,7 +7893,7 @@
       </w:rPr>
     </w:lvl>
   </w:abstractNum>
-  <w:abstractNum w:abstractNumId="15" w15:restartNumberingAfterBreak="0">
+  <w:abstractNum w:abstractNumId="16" w15:restartNumberingAfterBreak="0">
     <w:nsid w:val="6BB60391"/>
     <w:multiLevelType w:val="hybridMultilevel"/>
     <w:tmpl w:val="0E8671C4"/>
@@ -7695,7 +8006,7 @@
       </w:rPr>
     </w:lvl>
   </w:abstractNum>
-  <w:abstractNum w:abstractNumId="16" w15:restartNumberingAfterBreak="0">
+  <w:abstractNum w:abstractNumId="17" w15:restartNumberingAfterBreak="0">
     <w:nsid w:val="6F764576"/>
     <w:multiLevelType w:val="hybridMultilevel"/>
     <w:tmpl w:val="0EB6A60A"/>
@@ -7836,28 +8147,31 @@
     <w:abstractNumId w:val="0"/>
   </w:num>
   <w:num w:numId="10">
-    <w:abstractNumId w:val="16"/>
+    <w:abstractNumId w:val="17"/>
   </w:num>
   <w:num w:numId="11">
-    <w:abstractNumId w:val="10"/>
+    <w:abstractNumId w:val="11"/>
   </w:num>
   <w:num w:numId="12">
-    <w:abstractNumId w:val="11"/>
+    <w:abstractNumId w:val="12"/>
   </w:num>
   <w:num w:numId="13">
-    <w:abstractNumId w:val="13"/>
+    <w:abstractNumId w:val="14"/>
   </w:num>
   <w:num w:numId="14">
-    <w:abstractNumId w:val="12"/>
+    <w:abstractNumId w:val="13"/>
   </w:num>
   <w:num w:numId="15">
     <w:abstractNumId w:val="9"/>
   </w:num>
   <w:num w:numId="16">
-    <w:abstractNumId w:val="14"/>
+    <w:abstractNumId w:val="15"/>
   </w:num>
   <w:num w:numId="17">
-    <w:abstractNumId w:val="15"/>
+    <w:abstractNumId w:val="16"/>
+  </w:num>
+  <w:num w:numId="18">
+    <w:abstractNumId w:val="10"/>
   </w:num>
 </w:numbering>
 </file>

</xml_diff>

<commit_message>
Actualizacion de PDF - Nuevo integrante
</commit_message>
<xml_diff>
--- a/Documentos/SistemaMMA_Plantilla_Vision_.docx
+++ b/Documentos/SistemaMMA_Plantilla_Vision_.docx
@@ -98,8 +98,8 @@
           <w:rFonts w:cs="Times New Roman"/>
           <w:b/>
           <w:bCs/>
-          <w:sz w:val="28"/>
-          <w:szCs w:val="28"/>
+          <w:sz w:val="24"/>
+          <w:szCs w:val="24"/>
         </w:rPr>
       </w:pPr>
       <w:r>
@@ -107,8 +107,8 @@
           <w:rFonts w:cs="Times New Roman"/>
           <w:b/>
           <w:bCs/>
-          <w:sz w:val="28"/>
-          <w:szCs w:val="28"/>
+          <w:sz w:val="24"/>
+          <w:szCs w:val="24"/>
         </w:rPr>
         <w:t>UNIVERSIDAD DE ESPECIALIDADES ESPÍRITU SANTO</w:t>
       </w:r>
@@ -120,8 +120,8 @@
           <w:rFonts w:cs="Times New Roman"/>
           <w:b/>
           <w:bCs/>
-          <w:sz w:val="28"/>
-          <w:szCs w:val="28"/>
+          <w:sz w:val="24"/>
+          <w:szCs w:val="24"/>
         </w:rPr>
       </w:pPr>
       <w:r>
@@ -129,8 +129,8 @@
           <w:rFonts w:cs="Times New Roman"/>
           <w:b/>
           <w:bCs/>
-          <w:sz w:val="28"/>
-          <w:szCs w:val="28"/>
+          <w:sz w:val="24"/>
+          <w:szCs w:val="24"/>
         </w:rPr>
         <w:t>FACULTAD DE INGENIERÍA</w:t>
       </w:r>
@@ -142,8 +142,8 @@
           <w:rFonts w:cs="Times New Roman"/>
           <w:b/>
           <w:bCs/>
-          <w:sz w:val="28"/>
-          <w:szCs w:val="28"/>
+          <w:sz w:val="24"/>
+          <w:szCs w:val="24"/>
         </w:rPr>
       </w:pPr>
       <w:r>
@@ -151,8 +151,8 @@
           <w:rFonts w:cs="Times New Roman"/>
           <w:b/>
           <w:bCs/>
-          <w:sz w:val="28"/>
-          <w:szCs w:val="28"/>
+          <w:sz w:val="24"/>
+          <w:szCs w:val="24"/>
         </w:rPr>
         <w:t>CARRERA DE INGENIERÍA EN COMPUTACIÓN</w:t>
       </w:r>
@@ -164,8 +164,8 @@
           <w:rFonts w:cs="Times New Roman"/>
           <w:b/>
           <w:bCs/>
-          <w:sz w:val="28"/>
-          <w:szCs w:val="28"/>
+          <w:sz w:val="24"/>
+          <w:szCs w:val="24"/>
         </w:rPr>
       </w:pPr>
       <w:r>
@@ -173,8 +173,8 @@
           <w:rFonts w:cs="Times New Roman"/>
           <w:b/>
           <w:bCs/>
-          <w:sz w:val="28"/>
-          <w:szCs w:val="28"/>
+          <w:sz w:val="24"/>
+          <w:szCs w:val="24"/>
         </w:rPr>
         <w:t xml:space="preserve">Caso de </w:t>
       </w:r>
@@ -184,8 +184,8 @@
           <w:rFonts w:cs="Times New Roman"/>
           <w:b/>
           <w:bCs/>
-          <w:sz w:val="28"/>
-          <w:szCs w:val="28"/>
+          <w:sz w:val="24"/>
+          <w:szCs w:val="24"/>
         </w:rPr>
         <w:t>Estudio</w:t>
       </w:r>
@@ -196,11 +196,15 @@
         <w:jc w:val="center"/>
         <w:rPr>
           <w:rFonts w:cs="Times New Roman"/>
+          <w:sz w:val="24"/>
+          <w:szCs w:val="24"/>
         </w:rPr>
       </w:pPr>
       <w:r>
         <w:rPr>
           <w:rFonts w:cs="Times New Roman"/>
+          <w:sz w:val="24"/>
+          <w:szCs w:val="24"/>
         </w:rPr>
         <w:t xml:space="preserve">Sistema de </w:t>
       </w:r>
@@ -208,25 +212,17 @@
       <w:r>
         <w:rPr>
           <w:rFonts w:cs="Times New Roman"/>
-        </w:rPr>
-        <w:t>Gesti</w:t>
-      </w:r>
-      <w:r>
-        <w:rPr>
-          <w:rFonts w:cs="Times New Roman"/>
-        </w:rPr>
-        <w:t>ó</w:t>
-      </w:r>
-      <w:r>
-        <w:rPr>
-          <w:rFonts w:cs="Times New Roman"/>
-        </w:rPr>
-        <w:t>n</w:t>
+          <w:sz w:val="24"/>
+          <w:szCs w:val="24"/>
+        </w:rPr>
+        <w:t>Gestión</w:t>
       </w:r>
       <w:proofErr w:type="spellEnd"/>
       <w:r>
         <w:rPr>
           <w:rFonts w:cs="Times New Roman"/>
+          <w:sz w:val="24"/>
+          <w:szCs w:val="24"/>
         </w:rPr>
         <w:t xml:space="preserve"> </w:t>
       </w:r>
@@ -234,6 +230,8 @@
       <w:r>
         <w:rPr>
           <w:rFonts w:cs="Times New Roman"/>
+          <w:sz w:val="24"/>
+          <w:szCs w:val="24"/>
         </w:rPr>
         <w:t>para Academia</w:t>
       </w:r>
@@ -241,6 +239,8 @@
       <w:r>
         <w:rPr>
           <w:rFonts w:cs="Times New Roman"/>
+          <w:sz w:val="24"/>
+          <w:szCs w:val="24"/>
         </w:rPr>
         <w:t xml:space="preserve"> de Artes </w:t>
       </w:r>
@@ -248,6 +248,8 @@
       <w:r>
         <w:rPr>
           <w:rFonts w:cs="Times New Roman"/>
+          <w:sz w:val="24"/>
+          <w:szCs w:val="24"/>
         </w:rPr>
         <w:t>Marciales</w:t>
       </w:r>
@@ -255,6 +257,8 @@
       <w:r>
         <w:rPr>
           <w:rFonts w:cs="Times New Roman"/>
+          <w:sz w:val="24"/>
+          <w:szCs w:val="24"/>
         </w:rPr>
         <w:t xml:space="preserve"> </w:t>
       </w:r>
@@ -262,6 +266,8 @@
       <w:r>
         <w:rPr>
           <w:rFonts w:cs="Times New Roman"/>
+          <w:sz w:val="24"/>
+          <w:szCs w:val="24"/>
         </w:rPr>
         <w:t>Mixtas</w:t>
       </w:r>
@@ -269,6 +275,8 @@
       <w:r>
         <w:rPr>
           <w:rFonts w:cs="Times New Roman"/>
+          <w:sz w:val="24"/>
+          <w:szCs w:val="24"/>
         </w:rPr>
         <w:t xml:space="preserve"> (MMA)</w:t>
       </w:r>
@@ -280,8 +288,8 @@
           <w:rFonts w:cs="Times New Roman"/>
           <w:b/>
           <w:bCs/>
-          <w:sz w:val="28"/>
-          <w:szCs w:val="28"/>
+          <w:sz w:val="24"/>
+          <w:szCs w:val="24"/>
         </w:rPr>
       </w:pPr>
       <w:proofErr w:type="spellStart"/>
@@ -290,8 +298,8 @@
           <w:rFonts w:cs="Times New Roman"/>
           <w:b/>
           <w:bCs/>
-          <w:sz w:val="28"/>
-          <w:szCs w:val="28"/>
+          <w:sz w:val="24"/>
+          <w:szCs w:val="24"/>
         </w:rPr>
         <w:t>Nombre</w:t>
       </w:r>
@@ -301,8 +309,8 @@
           <w:rFonts w:cs="Times New Roman"/>
           <w:b/>
           <w:bCs/>
-          <w:sz w:val="28"/>
-          <w:szCs w:val="28"/>
+          <w:sz w:val="24"/>
+          <w:szCs w:val="24"/>
         </w:rPr>
         <w:t xml:space="preserve"> de</w:t>
       </w:r>
@@ -311,8 +319,8 @@
           <w:rFonts w:cs="Times New Roman"/>
           <w:b/>
           <w:bCs/>
-          <w:sz w:val="28"/>
-          <w:szCs w:val="28"/>
+          <w:sz w:val="24"/>
+          <w:szCs w:val="24"/>
         </w:rPr>
         <w:t xml:space="preserve"> los </w:t>
       </w:r>
@@ -322,8 +330,8 @@
           <w:rFonts w:cs="Times New Roman"/>
           <w:b/>
           <w:bCs/>
-          <w:sz w:val="28"/>
-          <w:szCs w:val="28"/>
+          <w:sz w:val="24"/>
+          <w:szCs w:val="24"/>
         </w:rPr>
         <w:t>integrantes</w:t>
       </w:r>
@@ -333,8 +341,8 @@
           <w:rFonts w:cs="Times New Roman"/>
           <w:b/>
           <w:bCs/>
-          <w:sz w:val="28"/>
-          <w:szCs w:val="28"/>
+          <w:sz w:val="24"/>
+          <w:szCs w:val="24"/>
         </w:rPr>
         <w:t>:</w:t>
       </w:r>
@@ -344,11 +352,15 @@
         <w:jc w:val="center"/>
         <w:rPr>
           <w:rFonts w:cs="Times New Roman"/>
+          <w:sz w:val="24"/>
+          <w:szCs w:val="24"/>
         </w:rPr>
       </w:pPr>
       <w:r>
         <w:rPr>
           <w:rFonts w:cs="Times New Roman"/>
+          <w:sz w:val="24"/>
+          <w:szCs w:val="24"/>
         </w:rPr>
         <w:t>García Coronado Ariel Alejandro</w:t>
       </w:r>
@@ -358,12 +370,16 @@
         <w:jc w:val="center"/>
         <w:rPr>
           <w:rFonts w:cs="Times New Roman"/>
+          <w:sz w:val="24"/>
+          <w:szCs w:val="24"/>
         </w:rPr>
       </w:pPr>
       <w:proofErr w:type="spellStart"/>
       <w:r>
         <w:rPr>
           <w:rFonts w:cs="Times New Roman"/>
+          <w:sz w:val="24"/>
+          <w:szCs w:val="24"/>
         </w:rPr>
         <w:t>Banchon</w:t>
       </w:r>
@@ -371,6 +387,8 @@
       <w:r>
         <w:rPr>
           <w:rFonts w:cs="Times New Roman"/>
+          <w:sz w:val="24"/>
+          <w:szCs w:val="24"/>
         </w:rPr>
         <w:t xml:space="preserve"> Miranda Alex Xavier</w:t>
       </w:r>
@@ -380,11 +398,15 @@
         <w:jc w:val="center"/>
         <w:rPr>
           <w:rFonts w:cs="Times New Roman"/>
+          <w:sz w:val="24"/>
+          <w:szCs w:val="24"/>
         </w:rPr>
       </w:pPr>
       <w:r>
         <w:rPr>
           <w:rFonts w:cs="Times New Roman"/>
+          <w:sz w:val="24"/>
+          <w:szCs w:val="24"/>
         </w:rPr>
         <w:t>Cuenca Guerrero Bryan Alejandro</w:t>
       </w:r>
@@ -394,12 +416,16 @@
         <w:jc w:val="center"/>
         <w:rPr>
           <w:rFonts w:cs="Times New Roman"/>
+          <w:sz w:val="24"/>
+          <w:szCs w:val="24"/>
         </w:rPr>
       </w:pPr>
       <w:proofErr w:type="spellStart"/>
       <w:r>
         <w:rPr>
           <w:rFonts w:cs="Times New Roman"/>
+          <w:sz w:val="24"/>
+          <w:szCs w:val="24"/>
         </w:rPr>
         <w:t>Suntasig</w:t>
       </w:r>
@@ -407,6 +433,8 @@
       <w:r>
         <w:rPr>
           <w:rFonts w:cs="Times New Roman"/>
+          <w:sz w:val="24"/>
+          <w:szCs w:val="24"/>
         </w:rPr>
         <w:t xml:space="preserve"> Moreno </w:t>
       </w:r>
@@ -414,6 +442,8 @@
       <w:r>
         <w:rPr>
           <w:rFonts w:cs="Times New Roman"/>
+          <w:sz w:val="24"/>
+          <w:szCs w:val="24"/>
         </w:rPr>
         <w:t>Jhonatan</w:t>
       </w:r>
@@ -421,6 +451,8 @@
       <w:r>
         <w:rPr>
           <w:rFonts w:cs="Times New Roman"/>
+          <w:sz w:val="24"/>
+          <w:szCs w:val="24"/>
         </w:rPr>
         <w:t xml:space="preserve"> David</w:t>
       </w:r>
@@ -430,12 +462,16 @@
         <w:jc w:val="center"/>
         <w:rPr>
           <w:rFonts w:cs="Times New Roman"/>
+          <w:sz w:val="24"/>
+          <w:szCs w:val="24"/>
         </w:rPr>
       </w:pPr>
       <w:proofErr w:type="spellStart"/>
       <w:r>
         <w:rPr>
           <w:rFonts w:cs="Times New Roman"/>
+          <w:sz w:val="24"/>
+          <w:szCs w:val="24"/>
         </w:rPr>
         <w:t>Uwaoma</w:t>
       </w:r>
@@ -443,6 +479,8 @@
       <w:r>
         <w:rPr>
           <w:rFonts w:cs="Times New Roman"/>
+          <w:sz w:val="24"/>
+          <w:szCs w:val="24"/>
         </w:rPr>
         <w:t xml:space="preserve"> Santos Wesley Ikechukwu</w:t>
       </w:r>
@@ -452,20 +490,48 @@
         <w:jc w:val="center"/>
         <w:rPr>
           <w:rFonts w:cs="Times New Roman"/>
-          <w:b/>
-          <w:bCs/>
-          <w:sz w:val="28"/>
-          <w:szCs w:val="28"/>
-        </w:rPr>
-      </w:pPr>
+          <w:sz w:val="24"/>
+          <w:szCs w:val="24"/>
+        </w:rPr>
+      </w:pPr>
+      <w:r>
+        <w:rPr>
+          <w:rFonts w:cs="Times New Roman"/>
+          <w:sz w:val="24"/>
+          <w:szCs w:val="24"/>
+        </w:rPr>
+        <w:t xml:space="preserve">Yanez Robert Erick </w:t>
+      </w:r>
       <w:proofErr w:type="spellStart"/>
       <w:r>
+        <w:rPr>
+          <w:rFonts w:cs="Times New Roman"/>
+          <w:sz w:val="24"/>
+          <w:szCs w:val="24"/>
+        </w:rPr>
+        <w:t>Ermundo</w:t>
+      </w:r>
+      <w:proofErr w:type="spellEnd"/>
+    </w:p>
+    <w:p>
+      <w:pPr>
+        <w:jc w:val="center"/>
         <w:rPr>
           <w:rFonts w:cs="Times New Roman"/>
           <w:b/>
           <w:bCs/>
-          <w:sz w:val="28"/>
-          <w:szCs w:val="28"/>
+          <w:sz w:val="24"/>
+          <w:szCs w:val="24"/>
+        </w:rPr>
+      </w:pPr>
+      <w:proofErr w:type="spellStart"/>
+      <w:r>
+        <w:rPr>
+          <w:rFonts w:cs="Times New Roman"/>
+          <w:b/>
+          <w:bCs/>
+          <w:sz w:val="24"/>
+          <w:szCs w:val="24"/>
         </w:rPr>
         <w:t>Asignatura</w:t>
       </w:r>
@@ -475,8 +541,8 @@
           <w:rFonts w:cs="Times New Roman"/>
           <w:b/>
           <w:bCs/>
-          <w:sz w:val="28"/>
-          <w:szCs w:val="28"/>
+          <w:sz w:val="24"/>
+          <w:szCs w:val="24"/>
         </w:rPr>
         <w:t xml:space="preserve"> y </w:t>
       </w:r>
@@ -486,8 +552,8 @@
           <w:rFonts w:cs="Times New Roman"/>
           <w:b/>
           <w:bCs/>
-          <w:sz w:val="28"/>
-          <w:szCs w:val="28"/>
+          <w:sz w:val="24"/>
+          <w:szCs w:val="24"/>
         </w:rPr>
         <w:t>paralelo</w:t>
       </w:r>
@@ -498,12 +564,16 @@
         <w:jc w:val="center"/>
         <w:rPr>
           <w:rFonts w:cs="Times New Roman"/>
+          <w:sz w:val="24"/>
+          <w:szCs w:val="24"/>
         </w:rPr>
       </w:pPr>
       <w:proofErr w:type="spellStart"/>
       <w:r>
         <w:rPr>
           <w:rFonts w:cs="Times New Roman"/>
+          <w:sz w:val="24"/>
+          <w:szCs w:val="24"/>
         </w:rPr>
         <w:t>Ingeniería</w:t>
       </w:r>
@@ -511,6 +581,8 @@
       <w:r>
         <w:rPr>
           <w:rFonts w:cs="Times New Roman"/>
+          <w:sz w:val="24"/>
+          <w:szCs w:val="24"/>
         </w:rPr>
         <w:t xml:space="preserve"> de Software II</w:t>
       </w:r>
@@ -520,8 +592,8 @@
         <w:jc w:val="center"/>
         <w:rPr>
           <w:rFonts w:cs="Times New Roman"/>
-          <w:sz w:val="28"/>
-          <w:szCs w:val="28"/>
+          <w:sz w:val="24"/>
+          <w:szCs w:val="24"/>
         </w:rPr>
       </w:pPr>
       <w:proofErr w:type="spellStart"/>
@@ -530,8 +602,8 @@
           <w:rFonts w:cs="Times New Roman"/>
           <w:b/>
           <w:bCs/>
-          <w:sz w:val="28"/>
-          <w:szCs w:val="28"/>
+          <w:sz w:val="24"/>
+          <w:szCs w:val="24"/>
         </w:rPr>
         <w:t>Docente</w:t>
       </w:r>
@@ -547,8 +619,6 @@
           <w:rStyle w:val="pspdfkit-6fq5ysqkmc2gc1fek9b659qfh8"/>
           <w:rFonts w:asciiTheme="minorHAnsi" w:hAnsiTheme="minorHAnsi" w:cs="Arial"/>
           <w:color w:val="000000"/>
-          <w:sz w:val="22"/>
-          <w:szCs w:val="22"/>
         </w:rPr>
       </w:pPr>
       <w:r>
@@ -556,8 +626,6 @@
           <w:rStyle w:val="pspdfkit-6fq5ysqkmc2gc1fek9b659qfh8"/>
           <w:rFonts w:asciiTheme="minorHAnsi" w:hAnsiTheme="minorHAnsi" w:cs="Arial"/>
           <w:color w:val="000000"/>
-          <w:sz w:val="22"/>
-          <w:szCs w:val="22"/>
         </w:rPr>
         <w:t xml:space="preserve">Ing. </w:t>
       </w:r>
@@ -567,8 +635,6 @@
           <w:rStyle w:val="pspdfkit-6fq5ysqkmc2gc1fek9b659qfh8"/>
           <w:rFonts w:asciiTheme="minorHAnsi" w:hAnsiTheme="minorHAnsi" w:cs="Arial"/>
           <w:color w:val="000000"/>
-          <w:sz w:val="22"/>
-          <w:szCs w:val="22"/>
         </w:rPr>
         <w:t>Garcia</w:t>
       </w:r>
@@ -578,8 +644,6 @@
           <w:rStyle w:val="pspdfkit-6fq5ysqkmc2gc1fek9b659qfh8"/>
           <w:rFonts w:asciiTheme="minorHAnsi" w:hAnsiTheme="minorHAnsi" w:cs="Arial"/>
           <w:color w:val="000000"/>
-          <w:sz w:val="22"/>
-          <w:szCs w:val="22"/>
         </w:rPr>
         <w:t xml:space="preserve"> </w:t>
       </w:r>
@@ -589,8 +653,6 @@
           <w:rStyle w:val="pspdfkit-6fq5ysqkmc2gc1fek9b659qfh8"/>
           <w:rFonts w:asciiTheme="minorHAnsi" w:hAnsiTheme="minorHAnsi" w:cs="Arial"/>
           <w:color w:val="000000"/>
-          <w:sz w:val="22"/>
-          <w:szCs w:val="22"/>
         </w:rPr>
         <w:t>Velasquez</w:t>
       </w:r>
@@ -600,8 +662,6 @@
           <w:rStyle w:val="pspdfkit-6fq5ysqkmc2gc1fek9b659qfh8"/>
           <w:rFonts w:asciiTheme="minorHAnsi" w:hAnsiTheme="minorHAnsi" w:cs="Arial"/>
           <w:color w:val="000000"/>
-          <w:sz w:val="22"/>
-          <w:szCs w:val="22"/>
         </w:rPr>
         <w:t xml:space="preserve"> Victoria De Lourdes</w:t>
       </w:r>
@@ -616,8 +676,6 @@
           <w:rStyle w:val="pspdfkit-6fq5ysqkmc2gc1fek9b659qfh8"/>
           <w:rFonts w:asciiTheme="minorHAnsi" w:hAnsiTheme="minorHAnsi" w:cs="Arial"/>
           <w:color w:val="000000"/>
-          <w:sz w:val="21"/>
-          <w:szCs w:val="21"/>
         </w:rPr>
       </w:pPr>
     </w:p>
@@ -628,8 +686,8 @@
           <w:rFonts w:cs="Times New Roman"/>
           <w:b/>
           <w:bCs/>
-          <w:sz w:val="28"/>
-          <w:szCs w:val="28"/>
+          <w:sz w:val="24"/>
+          <w:szCs w:val="24"/>
         </w:rPr>
       </w:pPr>
       <w:proofErr w:type="spellStart"/>
@@ -638,8 +696,8 @@
           <w:rFonts w:cs="Times New Roman"/>
           <w:b/>
           <w:bCs/>
-          <w:sz w:val="28"/>
-          <w:szCs w:val="28"/>
+          <w:sz w:val="24"/>
+          <w:szCs w:val="24"/>
         </w:rPr>
         <w:t>Fecha</w:t>
       </w:r>
@@ -649,8 +707,8 @@
           <w:rFonts w:cs="Times New Roman"/>
           <w:b/>
           <w:bCs/>
-          <w:sz w:val="28"/>
-          <w:szCs w:val="28"/>
+          <w:sz w:val="24"/>
+          <w:szCs w:val="24"/>
         </w:rPr>
         <w:t xml:space="preserve"> de </w:t>
       </w:r>
@@ -660,8 +718,8 @@
           <w:rFonts w:cs="Times New Roman"/>
           <w:b/>
           <w:bCs/>
-          <w:sz w:val="28"/>
-          <w:szCs w:val="28"/>
+          <w:sz w:val="24"/>
+          <w:szCs w:val="24"/>
         </w:rPr>
         <w:t>entrega</w:t>
       </w:r>
@@ -672,31 +730,17 @@
         <w:jc w:val="center"/>
         <w:rPr>
           <w:rFonts w:cs="Times New Roman"/>
+          <w:sz w:val="24"/>
+          <w:szCs w:val="24"/>
         </w:rPr>
       </w:pPr>
       <w:r>
         <w:rPr>
           <w:rFonts w:cs="Times New Roman"/>
-        </w:rPr>
-        <w:t>14</w:t>
-      </w:r>
-      <w:r>
-        <w:rPr>
-          <w:rFonts w:cs="Times New Roman"/>
-        </w:rPr>
-        <w:t>/</w:t>
-      </w:r>
-      <w:r>
-        <w:rPr>
-          <w:rFonts w:cs="Times New Roman"/>
-        </w:rPr>
-        <w:t>6</w:t>
-      </w:r>
-      <w:r>
-        <w:rPr>
-          <w:rFonts w:cs="Times New Roman"/>
-        </w:rPr>
-        <w:t>/2025</w:t>
+          <w:sz w:val="24"/>
+          <w:szCs w:val="24"/>
+        </w:rPr>
+        <w:t>14/6/2025</w:t>
       </w:r>
     </w:p>
     <w:p>
@@ -716,8 +760,8 @@
           <w:rFonts w:cs="Times New Roman"/>
           <w:b/>
           <w:bCs/>
-          <w:sz w:val="28"/>
-          <w:szCs w:val="28"/>
+          <w:sz w:val="24"/>
+          <w:szCs w:val="24"/>
         </w:rPr>
       </w:pPr>
       <w:proofErr w:type="spellStart"/>
@@ -726,8 +770,8 @@
           <w:rFonts w:cs="Times New Roman"/>
           <w:b/>
           <w:bCs/>
-          <w:sz w:val="28"/>
-          <w:szCs w:val="28"/>
+          <w:sz w:val="24"/>
+          <w:szCs w:val="24"/>
         </w:rPr>
         <w:t>Samborondón</w:t>
       </w:r>
@@ -737,8 +781,8 @@
           <w:rFonts w:cs="Times New Roman"/>
           <w:b/>
           <w:bCs/>
-          <w:sz w:val="28"/>
-          <w:szCs w:val="28"/>
+          <w:sz w:val="24"/>
+          <w:szCs w:val="24"/>
         </w:rPr>
         <w:t>-Ecuador</w:t>
       </w:r>
@@ -5239,32 +5283,252 @@
     </w:p>
     <w:p>
       <w:pPr>
-        <w:pStyle w:val="Ttulo1"/>
+        <w:pStyle w:val="Ttulo3"/>
+        <w:rPr>
+          <w:lang w:val="es-EC"/>
+        </w:rPr>
+      </w:pPr>
+      <w:bookmarkStart w:id="0" w:name="_Toc305867343"/>
+      <w:r>
+        <w:rPr>
+          <w:lang w:val="es-EC"/>
+        </w:rPr>
+        <w:lastRenderedPageBreak/>
+        <w:t>3</w:t>
+      </w:r>
+      <w:r>
+        <w:rPr>
+          <w:lang w:val="es-EC"/>
+        </w:rPr>
+        <w:t>.</w:t>
+      </w:r>
+      <w:r>
+        <w:rPr>
+          <w:lang w:val="es-EC"/>
+        </w:rPr>
+        <w:t>2 Historial de Usuario</w:t>
+      </w:r>
+    </w:p>
+    <w:p>
+      <w:pPr>
+        <w:rPr>
+          <w:b/>
+          <w:bCs/>
+          <w:lang w:val="es-EC"/>
+        </w:rPr>
+      </w:pPr>
+      <w:r>
+        <w:rPr>
+          <w:b/>
+          <w:bCs/>
+          <w:lang w:val="es-EC"/>
+        </w:rPr>
+        <w:t>Hu01</w:t>
+      </w:r>
+    </w:p>
+    <w:p>
+      <w:pPr>
+        <w:pStyle w:val="Prrafodelista"/>
+        <w:numPr>
+          <w:ilvl w:val="0"/>
+          <w:numId w:val="19"/>
+        </w:numPr>
+        <w:rPr>
+          <w:b/>
+          <w:bCs/>
+          <w:lang w:val="es-EC"/>
+        </w:rPr>
+      </w:pPr>
+      <w:r>
+        <w:rPr>
+          <w:lang w:val="es-EC"/>
+        </w:rPr>
+        <w:t>Como administrador quiero registrar alumnos para mantener actualizado el sistema.</w:t>
+      </w:r>
+    </w:p>
+    <w:p>
+      <w:pPr>
+        <w:rPr>
+          <w:b/>
+          <w:bCs/>
+          <w:lang w:val="es-EC"/>
+        </w:rPr>
+      </w:pPr>
+      <w:r>
+        <w:rPr>
+          <w:b/>
+          <w:bCs/>
+          <w:lang w:val="es-EC"/>
+        </w:rPr>
+        <w:t>HU02</w:t>
+      </w:r>
+    </w:p>
+    <w:p>
+      <w:pPr>
+        <w:pStyle w:val="Prrafodelista"/>
+        <w:numPr>
+          <w:ilvl w:val="0"/>
+          <w:numId w:val="19"/>
+        </w:numPr>
+        <w:rPr>
+          <w:lang w:val="es-EC"/>
+        </w:rPr>
+      </w:pPr>
+      <w:r>
+        <w:rPr>
+          <w:lang w:val="es-EC"/>
+        </w:rPr>
+        <w:t>Como recepcionista quiero registrar pagos para llevar el control financiero.</w:t>
+      </w:r>
+    </w:p>
+    <w:p>
+      <w:pPr>
+        <w:rPr>
+          <w:b/>
+          <w:bCs/>
+          <w:lang w:val="es-EC"/>
+        </w:rPr>
+      </w:pPr>
+      <w:r>
+        <w:rPr>
+          <w:b/>
+          <w:bCs/>
+          <w:lang w:val="es-EC"/>
+        </w:rPr>
+        <w:t>HU03</w:t>
+      </w:r>
+    </w:p>
+    <w:p>
+      <w:pPr>
+        <w:pStyle w:val="Prrafodelista"/>
+        <w:numPr>
+          <w:ilvl w:val="0"/>
+          <w:numId w:val="19"/>
+        </w:numPr>
+        <w:rPr>
+          <w:lang w:val="es-EC"/>
+        </w:rPr>
+      </w:pPr>
+      <w:r>
+        <w:rPr>
+          <w:lang w:val="es-EC"/>
+        </w:rPr>
+        <w:t>Como entrenador quiero registrar asistencia para controlar la participación de los alumnos</w:t>
+      </w:r>
+      <w:r>
+        <w:rPr>
+          <w:lang w:val="es-EC"/>
+        </w:rPr>
+        <w:t>.</w:t>
+      </w:r>
+    </w:p>
+    <w:p>
+      <w:pPr>
+        <w:rPr>
+          <w:b/>
+          <w:bCs/>
+          <w:lang w:val="es-EC"/>
+        </w:rPr>
+      </w:pPr>
+      <w:r>
+        <w:rPr>
+          <w:b/>
+          <w:bCs/>
+          <w:lang w:val="es-EC"/>
+        </w:rPr>
+        <w:t>HU04</w:t>
+      </w:r>
+    </w:p>
+    <w:p>
+      <w:pPr>
+        <w:pStyle w:val="Prrafodelista"/>
+        <w:numPr>
+          <w:ilvl w:val="0"/>
+          <w:numId w:val="19"/>
+        </w:numPr>
+        <w:rPr>
+          <w:lang w:val="es-EC"/>
+        </w:rPr>
+      </w:pPr>
+      <w:r>
+        <w:rPr>
+          <w:lang w:val="es-EC"/>
+        </w:rPr>
+        <w:t>Como alumno quiero consultar mis horarios para conocer mis clases</w:t>
+      </w:r>
+      <w:r>
+        <w:rPr>
+          <w:lang w:val="es-EC"/>
+        </w:rPr>
+        <w:t>.</w:t>
+      </w:r>
+    </w:p>
+    <w:p>
+      <w:pPr>
+        <w:rPr>
+          <w:b/>
+          <w:bCs/>
+          <w:lang w:val="es-EC"/>
+        </w:rPr>
+      </w:pPr>
+      <w:r>
+        <w:rPr>
+          <w:b/>
+          <w:bCs/>
+          <w:lang w:val="es-EC"/>
+        </w:rPr>
+        <w:t>HU05</w:t>
+      </w:r>
+    </w:p>
+    <w:p>
+      <w:pPr>
+        <w:pStyle w:val="Prrafodelista"/>
+        <w:numPr>
+          <w:ilvl w:val="0"/>
+          <w:numId w:val="19"/>
+        </w:numPr>
+        <w:rPr>
+          <w:lang w:val="es-EC"/>
+        </w:rPr>
+      </w:pPr>
+      <w:r>
+        <w:rPr>
+          <w:lang w:val="es-EC"/>
+        </w:rPr>
+        <w:t>Como administrador quiero generar reportes para analizar el rendimiento de la academia</w:t>
+      </w:r>
+      <w:r>
+        <w:rPr>
+          <w:lang w:val="es-EC"/>
+        </w:rPr>
+        <w:t>.</w:t>
+      </w:r>
+    </w:p>
+    <w:p>
+      <w:pPr>
         <w:rPr>
           <w:rStyle w:val="nfasisintenso"/>
-          <w:b/>
+          <w:b w:val="0"/>
+          <w:bCs w:val="0"/>
+          <w:i w:val="0"/>
+          <w:iCs w:val="0"/>
+          <w:color w:val="auto"/>
+          <w:lang w:val="es-EC"/>
+        </w:rPr>
+      </w:pPr>
+      <w:r>
+        <w:rPr>
+          <w:rStyle w:val="nfasisintenso"/>
           <w:i w:val="0"/>
           <w:color w:val="365F91"/>
           <w:lang w:val="es-EC"/>
         </w:rPr>
-      </w:pPr>
-      <w:bookmarkStart w:id="0" w:name="_Toc305867343"/>
-      <w:r>
-        <w:rPr>
-          <w:rStyle w:val="nfasisintenso"/>
-          <w:b/>
-          <w:i w:val="0"/>
-          <w:color w:val="365F91"/>
-          <w:lang w:val="es-EC"/>
-        </w:rPr>
-        <w:lastRenderedPageBreak/>
         <w:t xml:space="preserve">4. DIAGRAMA DE </w:t>
       </w:r>
       <w:bookmarkEnd w:id="0"/>
       <w:r>
         <w:rPr>
           <w:rStyle w:val="nfasisintenso"/>
-          <w:b/>
           <w:i w:val="0"/>
           <w:color w:val="365F91"/>
           <w:lang w:val="es-EC"/>
@@ -5407,6 +5671,7 @@
           <w:color w:val="auto"/>
           <w:lang w:val="es-EC"/>
         </w:rPr>
+        <w:lastRenderedPageBreak/>
         <w:t>Interacciones</w:t>
       </w:r>
     </w:p>
@@ -5689,7 +5954,6 @@
         <w:rPr>
           <w:lang w:val="es-EC"/>
         </w:rPr>
-        <w:lastRenderedPageBreak/>
         <w:t>4</w:t>
       </w:r>
       <w:r>
@@ -5742,16 +6006,16 @@
           <w:lang w:val="es-EC"/>
         </w:rPr>
         <w:drawing>
-          <wp:anchor distT="0" distB="0" distL="114300" distR="114300" simplePos="0" relativeHeight="251664384" behindDoc="0" locked="0" layoutInCell="1" allowOverlap="1" wp14:anchorId="2C8CA747" wp14:editId="4CCDBD61">
+          <wp:anchor distT="0" distB="0" distL="114300" distR="114300" simplePos="0" relativeHeight="251664384" behindDoc="0" locked="0" layoutInCell="1" allowOverlap="1" wp14:anchorId="2C8CA747" wp14:editId="17D01F3A">
             <wp:simplePos x="0" y="0"/>
-            <wp:positionH relativeFrom="column">
-              <wp:posOffset>666683</wp:posOffset>
+            <wp:positionH relativeFrom="margin">
+              <wp:align>center</wp:align>
             </wp:positionH>
             <wp:positionV relativeFrom="paragraph">
-              <wp:posOffset>6985</wp:posOffset>
+              <wp:posOffset>3810</wp:posOffset>
             </wp:positionV>
-            <wp:extent cx="4155440" cy="4650740"/>
-            <wp:effectExtent l="0" t="0" r="0" b="0"/>
+            <wp:extent cx="3209925" cy="3592830"/>
+            <wp:effectExtent l="0" t="0" r="9525" b="7620"/>
             <wp:wrapSquare wrapText="bothSides"/>
             <wp:docPr id="3" name="Imagen 3"/>
             <wp:cNvGraphicFramePr>
@@ -5780,7 +6044,7 @@
                   <pic:spPr bwMode="auto">
                     <a:xfrm>
                       <a:off x="0" y="0"/>
-                      <a:ext cx="4155440" cy="4650740"/>
+                      <a:ext cx="3209925" cy="3592830"/>
                     </a:xfrm>
                     <a:prstGeom prst="rect">
                       <a:avLst/>
@@ -5890,27 +6154,6 @@
     <w:p>
       <w:pPr>
         <w:rPr>
-          <w:lang w:val="es-EC"/>
-        </w:rPr>
-      </w:pPr>
-    </w:p>
-    <w:p>
-      <w:pPr>
-        <w:rPr>
-          <w:lang w:val="es-EC"/>
-        </w:rPr>
-      </w:pPr>
-    </w:p>
-    <w:p>
-      <w:pPr>
-        <w:rPr>
-          <w:lang w:val="es-EC"/>
-        </w:rPr>
-      </w:pPr>
-    </w:p>
-    <w:p>
-      <w:pPr>
-        <w:rPr>
           <w:b/>
           <w:bCs/>
           <w:lang w:val="es-EC"/>
@@ -5922,6 +6165,7 @@
           <w:bCs/>
           <w:lang w:val="es-EC"/>
         </w:rPr>
+        <w:lastRenderedPageBreak/>
         <w:t>Leyenda:</w:t>
       </w:r>
     </w:p>
@@ -6093,7 +6337,6 @@
           <w:color w:val="365F91"/>
           <w:lang w:val="es-EC"/>
         </w:rPr>
-        <w:lastRenderedPageBreak/>
         <w:t>5</w:t>
       </w:r>
       <w:r>
@@ -6240,7 +6483,13 @@
         <w:rPr>
           <w:lang w:val="es-EC"/>
         </w:rPr>
-        <w:t>En este caso, será de un solo integrante:</w:t>
+        <w:t>El equipo de desarrollo está conformado por los siguientes integrantes</w:t>
+      </w:r>
+      <w:r>
+        <w:rPr>
+          <w:lang w:val="es-EC"/>
+        </w:rPr>
+        <w:t>:</w:t>
       </w:r>
     </w:p>
     <w:p>
@@ -6376,6 +6625,32 @@
         </w:rPr>
         <w:t xml:space="preserve"> Santos Wesley Ikechukwu</w:t>
       </w:r>
+    </w:p>
+    <w:p>
+      <w:pPr>
+        <w:pStyle w:val="Prrafodelista"/>
+        <w:numPr>
+          <w:ilvl w:val="0"/>
+          <w:numId w:val="18"/>
+        </w:numPr>
+        <w:rPr>
+          <w:rFonts w:cs="Times New Roman"/>
+        </w:rPr>
+      </w:pPr>
+      <w:r>
+        <w:rPr>
+          <w:rFonts w:cs="Times New Roman"/>
+        </w:rPr>
+        <w:t xml:space="preserve">Yanez Robert Erick </w:t>
+      </w:r>
+      <w:proofErr w:type="spellStart"/>
+      <w:r>
+        <w:rPr>
+          <w:rFonts w:cs="Times New Roman"/>
+        </w:rPr>
+        <w:t>Ermundo</w:t>
+      </w:r>
+      <w:proofErr w:type="spellEnd"/>
     </w:p>
     <w:p>
       <w:pPr>
@@ -6891,13 +7166,6 @@
         </w:tc>
       </w:tr>
     </w:tbl>
-    <w:p>
-      <w:pPr>
-        <w:rPr>
-          <w:lang w:val="es-EC"/>
-        </w:rPr>
-      </w:pPr>
-    </w:p>
     <w:p>
       <w:pPr>
         <w:rPr>
@@ -7442,6 +7710,119 @@
     </w:lvl>
   </w:abstractNum>
   <w:abstractNum w:abstractNumId="12" w15:restartNumberingAfterBreak="0">
+    <w:nsid w:val="19C42C25"/>
+    <w:multiLevelType w:val="hybridMultilevel"/>
+    <w:tmpl w:val="060C3B30"/>
+    <w:lvl w:ilvl="0" w:tplc="300A0001">
+      <w:start w:val="1"/>
+      <w:numFmt w:val="bullet"/>
+      <w:lvlText w:val=""/>
+      <w:lvlJc w:val="left"/>
+      <w:pPr>
+        <w:ind w:left="720" w:hanging="360"/>
+      </w:pPr>
+      <w:rPr>
+        <w:rFonts w:ascii="Symbol" w:hAnsi="Symbol" w:hint="default"/>
+      </w:rPr>
+    </w:lvl>
+    <w:lvl w:ilvl="1" w:tplc="300A0003" w:tentative="1">
+      <w:start w:val="1"/>
+      <w:numFmt w:val="bullet"/>
+      <w:lvlText w:val="o"/>
+      <w:lvlJc w:val="left"/>
+      <w:pPr>
+        <w:ind w:left="1440" w:hanging="360"/>
+      </w:pPr>
+      <w:rPr>
+        <w:rFonts w:ascii="Courier New" w:hAnsi="Courier New" w:cs="Courier New" w:hint="default"/>
+      </w:rPr>
+    </w:lvl>
+    <w:lvl w:ilvl="2" w:tplc="300A0005" w:tentative="1">
+      <w:start w:val="1"/>
+      <w:numFmt w:val="bullet"/>
+      <w:lvlText w:val=""/>
+      <w:lvlJc w:val="left"/>
+      <w:pPr>
+        <w:ind w:left="2160" w:hanging="360"/>
+      </w:pPr>
+      <w:rPr>
+        <w:rFonts w:ascii="Wingdings" w:hAnsi="Wingdings" w:hint="default"/>
+      </w:rPr>
+    </w:lvl>
+    <w:lvl w:ilvl="3" w:tplc="300A0001" w:tentative="1">
+      <w:start w:val="1"/>
+      <w:numFmt w:val="bullet"/>
+      <w:lvlText w:val=""/>
+      <w:lvlJc w:val="left"/>
+      <w:pPr>
+        <w:ind w:left="2880" w:hanging="360"/>
+      </w:pPr>
+      <w:rPr>
+        <w:rFonts w:ascii="Symbol" w:hAnsi="Symbol" w:hint="default"/>
+      </w:rPr>
+    </w:lvl>
+    <w:lvl w:ilvl="4" w:tplc="300A0003" w:tentative="1">
+      <w:start w:val="1"/>
+      <w:numFmt w:val="bullet"/>
+      <w:lvlText w:val="o"/>
+      <w:lvlJc w:val="left"/>
+      <w:pPr>
+        <w:ind w:left="3600" w:hanging="360"/>
+      </w:pPr>
+      <w:rPr>
+        <w:rFonts w:ascii="Courier New" w:hAnsi="Courier New" w:cs="Courier New" w:hint="default"/>
+      </w:rPr>
+    </w:lvl>
+    <w:lvl w:ilvl="5" w:tplc="300A0005" w:tentative="1">
+      <w:start w:val="1"/>
+      <w:numFmt w:val="bullet"/>
+      <w:lvlText w:val=""/>
+      <w:lvlJc w:val="left"/>
+      <w:pPr>
+        <w:ind w:left="4320" w:hanging="360"/>
+      </w:pPr>
+      <w:rPr>
+        <w:rFonts w:ascii="Wingdings" w:hAnsi="Wingdings" w:hint="default"/>
+      </w:rPr>
+    </w:lvl>
+    <w:lvl w:ilvl="6" w:tplc="300A0001" w:tentative="1">
+      <w:start w:val="1"/>
+      <w:numFmt w:val="bullet"/>
+      <w:lvlText w:val=""/>
+      <w:lvlJc w:val="left"/>
+      <w:pPr>
+        <w:ind w:left="5040" w:hanging="360"/>
+      </w:pPr>
+      <w:rPr>
+        <w:rFonts w:ascii="Symbol" w:hAnsi="Symbol" w:hint="default"/>
+      </w:rPr>
+    </w:lvl>
+    <w:lvl w:ilvl="7" w:tplc="300A0003" w:tentative="1">
+      <w:start w:val="1"/>
+      <w:numFmt w:val="bullet"/>
+      <w:lvlText w:val="o"/>
+      <w:lvlJc w:val="left"/>
+      <w:pPr>
+        <w:ind w:left="5760" w:hanging="360"/>
+      </w:pPr>
+      <w:rPr>
+        <w:rFonts w:ascii="Courier New" w:hAnsi="Courier New" w:cs="Courier New" w:hint="default"/>
+      </w:rPr>
+    </w:lvl>
+    <w:lvl w:ilvl="8" w:tplc="300A0005" w:tentative="1">
+      <w:start w:val="1"/>
+      <w:numFmt w:val="bullet"/>
+      <w:lvlText w:val=""/>
+      <w:lvlJc w:val="left"/>
+      <w:pPr>
+        <w:ind w:left="6480" w:hanging="360"/>
+      </w:pPr>
+      <w:rPr>
+        <w:rFonts w:ascii="Wingdings" w:hAnsi="Wingdings" w:hint="default"/>
+      </w:rPr>
+    </w:lvl>
+  </w:abstractNum>
+  <w:abstractNum w:abstractNumId="13" w15:restartNumberingAfterBreak="0">
     <w:nsid w:val="1F9D0BF8"/>
     <w:multiLevelType w:val="hybridMultilevel"/>
     <w:tmpl w:val="A1E688F6"/>
@@ -7554,7 +7935,7 @@
       </w:rPr>
     </w:lvl>
   </w:abstractNum>
-  <w:abstractNum w:abstractNumId="13" w15:restartNumberingAfterBreak="0">
+  <w:abstractNum w:abstractNumId="14" w15:restartNumberingAfterBreak="0">
     <w:nsid w:val="26D629AB"/>
     <w:multiLevelType w:val="hybridMultilevel"/>
     <w:tmpl w:val="6C9C2330"/>
@@ -7667,7 +8048,7 @@
       </w:rPr>
     </w:lvl>
   </w:abstractNum>
-  <w:abstractNum w:abstractNumId="14" w15:restartNumberingAfterBreak="0">
+  <w:abstractNum w:abstractNumId="15" w15:restartNumberingAfterBreak="0">
     <w:nsid w:val="51AD314E"/>
     <w:multiLevelType w:val="hybridMultilevel"/>
     <w:tmpl w:val="67C219F2"/>
@@ -7780,7 +8161,7 @@
       </w:rPr>
     </w:lvl>
   </w:abstractNum>
-  <w:abstractNum w:abstractNumId="15" w15:restartNumberingAfterBreak="0">
+  <w:abstractNum w:abstractNumId="16" w15:restartNumberingAfterBreak="0">
     <w:nsid w:val="62C03BF7"/>
     <w:multiLevelType w:val="hybridMultilevel"/>
     <w:tmpl w:val="88BC0F48"/>
@@ -7893,7 +8274,7 @@
       </w:rPr>
     </w:lvl>
   </w:abstractNum>
-  <w:abstractNum w:abstractNumId="16" w15:restartNumberingAfterBreak="0">
+  <w:abstractNum w:abstractNumId="17" w15:restartNumberingAfterBreak="0">
     <w:nsid w:val="6BB60391"/>
     <w:multiLevelType w:val="hybridMultilevel"/>
     <w:tmpl w:val="0E8671C4"/>
@@ -8006,7 +8387,7 @@
       </w:rPr>
     </w:lvl>
   </w:abstractNum>
-  <w:abstractNum w:abstractNumId="17" w15:restartNumberingAfterBreak="0">
+  <w:abstractNum w:abstractNumId="18" w15:restartNumberingAfterBreak="0">
     <w:nsid w:val="6F764576"/>
     <w:multiLevelType w:val="hybridMultilevel"/>
     <w:tmpl w:val="0EB6A60A"/>
@@ -8147,31 +8528,34 @@
     <w:abstractNumId w:val="0"/>
   </w:num>
   <w:num w:numId="10">
-    <w:abstractNumId w:val="17"/>
+    <w:abstractNumId w:val="18"/>
   </w:num>
   <w:num w:numId="11">
     <w:abstractNumId w:val="11"/>
   </w:num>
   <w:num w:numId="12">
-    <w:abstractNumId w:val="12"/>
+    <w:abstractNumId w:val="13"/>
   </w:num>
   <w:num w:numId="13">
-    <w:abstractNumId w:val="14"/>
+    <w:abstractNumId w:val="15"/>
   </w:num>
   <w:num w:numId="14">
-    <w:abstractNumId w:val="13"/>
+    <w:abstractNumId w:val="14"/>
   </w:num>
   <w:num w:numId="15">
     <w:abstractNumId w:val="9"/>
   </w:num>
   <w:num w:numId="16">
-    <w:abstractNumId w:val="15"/>
+    <w:abstractNumId w:val="16"/>
   </w:num>
   <w:num w:numId="17">
-    <w:abstractNumId w:val="16"/>
+    <w:abstractNumId w:val="17"/>
   </w:num>
   <w:num w:numId="18">
     <w:abstractNumId w:val="10"/>
+  </w:num>
+  <w:num w:numId="19">
+    <w:abstractNumId w:val="12"/>
   </w:num>
 </w:numbering>
 </file>

</xml_diff>